<commit_message>
Add conacts to load and unload
</commit_message>
<xml_diff>
--- a/templates/docs/agreement_request_template.docx
+++ b/templates/docs/agreement_request_template.docx
@@ -153,9 +153,9 @@
       </w:tblPr>
       <w:tblGrid>
         <w:gridCol w:w="1173"/>
-        <w:gridCol w:w="4196"/>
+        <w:gridCol w:w="4195"/>
         <w:gridCol w:w="1173"/>
-        <w:gridCol w:w="4220"/>
+        <w:gridCol w:w="4221"/>
       </w:tblGrid>
       <w:tr>
         <w:trPr>
@@ -360,16 +360,7 @@
                 <w:szCs w:val="20"/>
                 <w:lang w:val="en-US"/>
               </w:rPr>
-              <w:t xml:space="preserve"> </w:t>
-            </w:r>
-            <w:r>
-              <w:rPr>
-                <w:rFonts w:ascii="Arial" w:hAnsi="Arial" w:cs="Arial"/>
-                <w:sz w:val="20"/>
-                <w:szCs w:val="20"/>
-                <w:lang w:val="en-US"/>
-              </w:rPr>
-              <w:t>un</w:t>
+              <w:t xml:space="preserve"> un</w:t>
             </w:r>
             <w:r>
               <w:rPr>
@@ -710,6 +701,26 @@
                 <w:rFonts w:ascii="Arial" w:hAnsi="Arial" w:cs="Arial"/>
                 <w:sz w:val="20"/>
                 <w:szCs w:val="20"/>
+                <w:lang w:val="en-US"/>
+              </w:rPr>
+            </w:pPr>
+            <w:r>
+              <w:rPr>
+                <w:rFonts w:ascii="Arial" w:hAnsi="Arial" w:cs="Arial"/>
+                <w:sz w:val="20"/>
+                <w:szCs w:val="20"/>
+                <w:lang w:val="en-US"/>
+              </w:rPr>
+              <w:t>{{ loading_contact_name }}</w:t>
+            </w:r>
+          </w:p>
+          <w:p>
+            <w:pPr>
+              <w:rPr>
+                <w:rFonts w:ascii="Arial" w:hAnsi="Arial" w:cs="Arial"/>
+                <w:sz w:val="20"/>
+                <w:szCs w:val="20"/>
+                <w:lang w:val="en-US"/>
               </w:rPr>
             </w:pPr>
           </w:p>
@@ -756,6 +767,25 @@
             <w:shd w:val="clear" w:color="auto" w:fill="auto"/>
             <w:vAlign w:val="center"/>
           </w:tcPr>
+          <w:p>
+            <w:pPr>
+              <w:rPr>
+                <w:rFonts w:ascii="Arial" w:hAnsi="Arial" w:cs="Arial"/>
+                <w:sz w:val="20"/>
+                <w:szCs w:val="20"/>
+                <w:lang w:val="en-US"/>
+              </w:rPr>
+            </w:pPr>
+            <w:r>
+              <w:rPr>
+                <w:rFonts w:ascii="Arial" w:hAnsi="Arial" w:cs="Arial"/>
+                <w:sz w:val="20"/>
+                <w:szCs w:val="20"/>
+                <w:lang w:val="en-US"/>
+              </w:rPr>
+              <w:t>{{ unloading_contact_name }}</w:t>
+            </w:r>
+          </w:p>
           <w:p>
             <w:pPr>
               <w:rPr>
@@ -811,6 +841,25 @@
                 <w:rFonts w:ascii="Arial" w:hAnsi="Arial" w:cs="Arial"/>
                 <w:sz w:val="20"/>
                 <w:szCs w:val="20"/>
+                <w:lang w:val="en-US"/>
+              </w:rPr>
+            </w:pPr>
+            <w:r>
+              <w:rPr>
+                <w:rFonts w:ascii="Arial" w:hAnsi="Arial" w:cs="Arial"/>
+                <w:sz w:val="20"/>
+                <w:szCs w:val="20"/>
+                <w:lang w:val="en-US"/>
+              </w:rPr>
+              <w:t>{{ loading_contact_phone }}</w:t>
+            </w:r>
+          </w:p>
+          <w:p>
+            <w:pPr>
+              <w:rPr>
+                <w:rFonts w:ascii="Arial" w:hAnsi="Arial" w:cs="Arial"/>
+                <w:sz w:val="20"/>
+                <w:szCs w:val="20"/>
               </w:rPr>
             </w:pPr>
           </w:p>
@@ -856,6 +905,15 @@
                 <w:szCs w:val="20"/>
               </w:rPr>
             </w:pPr>
+            <w:r>
+              <w:rPr>
+                <w:rFonts w:ascii="Arial" w:hAnsi="Arial" w:cs="Arial"/>
+                <w:sz w:val="20"/>
+                <w:szCs w:val="20"/>
+                <w:lang w:val="en-US"/>
+              </w:rPr>
+              <w:t>{{ unloading_contact_phone }}</w:t>
+            </w:r>
           </w:p>
         </w:tc>
       </w:tr>
@@ -1568,16 +1626,7 @@
                 <w:szCs w:val="20"/>
                 <w:lang w:val="en-US"/>
               </w:rPr>
-              <w:t xml:space="preserve">{{ </w:t>
-            </w:r>
-            <w:r>
-              <w:rPr>
-                <w:rFonts w:ascii="Arial" w:hAnsi="Arial" w:cs="Arial"/>
-                <w:sz w:val="20"/>
-                <w:szCs w:val="20"/>
-                <w:lang w:val="en-US"/>
-              </w:rPr>
-              <w:t>un</w:t>
+              <w:t>{{ un</w:t>
             </w:r>
             <w:r>
               <w:rPr>
@@ -1678,25 +1727,7 @@
                 <w:szCs w:val="20"/>
                 <w:lang w:val="en-US"/>
               </w:rPr>
-              <w:t xml:space="preserve">{{ </w:t>
-            </w:r>
-            <w:r>
-              <w:rPr>
-                <w:rFonts w:ascii="Arial" w:hAnsi="Arial" w:cs="Arial"/>
-                <w:sz w:val="20"/>
-                <w:szCs w:val="20"/>
-                <w:lang w:val="en-US"/>
-              </w:rPr>
-              <w:t>client_cost</w:t>
-            </w:r>
-            <w:r>
-              <w:rPr>
-                <w:rFonts w:ascii="Arial" w:hAnsi="Arial" w:cs="Arial"/>
-                <w:sz w:val="20"/>
-                <w:szCs w:val="20"/>
-                <w:lang w:val="en-US"/>
-              </w:rPr>
-              <w:t xml:space="preserve"> }}</w:t>
+              <w:t>{{ client_cost }}</w:t>
             </w:r>
           </w:p>
         </w:tc>
@@ -2059,15 +2090,7 @@
                 <w:sz w:val="20"/>
                 <w:szCs w:val="20"/>
               </w:rPr>
-              <w:t xml:space="preserve"> </w:t>
-            </w:r>
-            <w:r>
-              <w:rPr>
-                <w:rFonts w:ascii="Arial" w:hAnsi="Arial" w:cs="Arial"/>
-                <w:sz w:val="20"/>
-                <w:szCs w:val="20"/>
-              </w:rPr>
-              <w:t xml:space="preserve">{{  </w:t>
+              <w:t xml:space="preserve"> {{  </w:t>
             </w:r>
             <w:r>
               <w:rPr>
@@ -2368,26 +2391,74 @@
                 <w:rFonts w:ascii="Arial" w:hAnsi="Arial" w:cs="Arial"/>
                 <w:sz w:val="16"/>
                 <w:szCs w:val="16"/>
-                <w:lang w:val="en-US"/>
-              </w:rPr>
-            </w:pPr>
-            <w:r>
-              <w:rPr>
-                <w:rFonts w:ascii="Arial" w:hAnsi="Arial" w:cs="Arial"/>
-                <w:sz w:val="16"/>
-                <w:szCs w:val="16"/>
-                <w:lang w:val="en-US"/>
-              </w:rPr>
-              <w:t>{{ client.short_name }}</w:t>
-            </w:r>
-          </w:p>
-          <w:p>
-            <w:pPr>
-              <w:rPr>
-                <w:rFonts w:ascii="Arial" w:hAnsi="Arial" w:cs="Arial"/>
-                <w:sz w:val="16"/>
-                <w:szCs w:val="16"/>
-                <w:lang w:val="en-US"/>
+              </w:rPr>
+            </w:pPr>
+            <w:r>
+              <w:rPr>
+                <w:rFonts w:ascii="Arial" w:hAnsi="Arial" w:cs="Arial"/>
+                <w:sz w:val="16"/>
+                <w:szCs w:val="16"/>
+              </w:rPr>
+              <w:t xml:space="preserve">{{ </w:t>
+            </w:r>
+            <w:r>
+              <w:rPr>
+                <w:rFonts w:ascii="Arial" w:hAnsi="Arial" w:cs="Arial"/>
+                <w:sz w:val="16"/>
+                <w:szCs w:val="16"/>
+                <w:lang w:val="en-US"/>
+              </w:rPr>
+              <w:t>client</w:t>
+            </w:r>
+            <w:r>
+              <w:rPr>
+                <w:rFonts w:ascii="Arial" w:hAnsi="Arial" w:cs="Arial"/>
+                <w:sz w:val="16"/>
+                <w:szCs w:val="16"/>
+              </w:rPr>
+              <w:t>.</w:t>
+            </w:r>
+            <w:r>
+              <w:rPr>
+                <w:rFonts w:ascii="Arial" w:hAnsi="Arial" w:cs="Arial"/>
+                <w:sz w:val="16"/>
+                <w:szCs w:val="16"/>
+                <w:lang w:val="en-US"/>
+              </w:rPr>
+              <w:t>short</w:t>
+            </w:r>
+            <w:r>
+              <w:rPr>
+                <w:rFonts w:ascii="Arial" w:hAnsi="Arial" w:cs="Arial"/>
+                <w:sz w:val="16"/>
+                <w:szCs w:val="16"/>
+              </w:rPr>
+              <w:t>_</w:t>
+            </w:r>
+            <w:r>
+              <w:rPr>
+                <w:rFonts w:ascii="Arial" w:hAnsi="Arial" w:cs="Arial"/>
+                <w:sz w:val="16"/>
+                <w:szCs w:val="16"/>
+                <w:lang w:val="en-US"/>
+              </w:rPr>
+              <w:t>name</w:t>
+            </w:r>
+            <w:r>
+              <w:rPr>
+                <w:rFonts w:ascii="Arial" w:hAnsi="Arial" w:cs="Arial"/>
+                <w:sz w:val="16"/>
+                <w:szCs w:val="16"/>
+              </w:rPr>
+              <w:t xml:space="preserve"> }}</w:t>
+            </w:r>
+          </w:p>
+          <w:p>
+            <w:pPr>
+              <w:rPr>
+                <w:rFonts w:ascii="Arial" w:hAnsi="Arial" w:cs="Arial"/>
+                <w:sz w:val="16"/>
+                <w:szCs w:val="16"/>
               </w:rPr>
             </w:pPr>
             <w:r>
@@ -2403,7 +2474,57 @@
                 <w:rFonts w:ascii="Arial" w:hAnsi="Arial" w:cs="Arial"/>
                 <w:sz w:val="16"/>
                 <w:szCs w:val="16"/>
-                <w:lang w:val="en-US"/>
+              </w:rPr>
+              <w:t xml:space="preserve"> {{ </w:t>
+            </w:r>
+            <w:r>
+              <w:rPr>
+                <w:rFonts w:ascii="Arial" w:hAnsi="Arial" w:cs="Arial"/>
+                <w:sz w:val="16"/>
+                <w:szCs w:val="16"/>
+                <w:lang w:val="en-US"/>
+              </w:rPr>
+              <w:t>client</w:t>
+            </w:r>
+            <w:r>
+              <w:rPr>
+                <w:rFonts w:ascii="Arial" w:hAnsi="Arial" w:cs="Arial"/>
+                <w:sz w:val="16"/>
+                <w:szCs w:val="16"/>
+              </w:rPr>
+              <w:t>.</w:t>
+            </w:r>
+            <w:r>
+              <w:rPr>
+                <w:rFonts w:ascii="Arial" w:hAnsi="Arial" w:cs="Arial"/>
+                <w:sz w:val="16"/>
+                <w:szCs w:val="16"/>
+                <w:lang w:val="en-US"/>
+              </w:rPr>
+              <w:t>inn</w:t>
+            </w:r>
+            <w:r>
+              <w:rPr>
+                <w:rFonts w:ascii="Arial" w:hAnsi="Arial" w:cs="Arial"/>
+                <w:sz w:val="16"/>
+                <w:szCs w:val="16"/>
+              </w:rPr>
+              <w:t xml:space="preserve"> }} {% </w:t>
+            </w:r>
+            <w:r>
+              <w:rPr>
+                <w:rFonts w:ascii="Arial" w:hAnsi="Arial" w:cs="Arial"/>
+                <w:sz w:val="16"/>
+                <w:szCs w:val="16"/>
+                <w:lang w:val="en-US"/>
+              </w:rPr>
+              <w:t>if</w:t>
+            </w:r>
+            <w:r>
+              <w:rPr>
+                <w:rFonts w:ascii="Arial" w:hAnsi="Arial" w:cs="Arial"/>
+                <w:sz w:val="16"/>
+                <w:szCs w:val="16"/>
               </w:rPr>
               <w:t xml:space="preserve"> </w:t>
             </w:r>
@@ -2414,14 +2535,122 @@
                 <w:szCs w:val="16"/>
                 <w:lang w:val="en-US"/>
               </w:rPr>
-              <w:t>{{ client.inn }}</w:t>
-            </w:r>
-            <w:r>
-              <w:rPr>
-                <w:rFonts w:ascii="Arial" w:hAnsi="Arial" w:cs="Arial"/>
-                <w:sz w:val="16"/>
-                <w:szCs w:val="16"/>
-                <w:lang w:val="en-US"/>
+              <w:t>client</w:t>
+            </w:r>
+            <w:r>
+              <w:rPr>
+                <w:rFonts w:ascii="Arial" w:hAnsi="Arial" w:cs="Arial"/>
+                <w:sz w:val="16"/>
+                <w:szCs w:val="16"/>
+              </w:rPr>
+              <w:t>.</w:t>
+            </w:r>
+            <w:r>
+              <w:rPr>
+                <w:rFonts w:ascii="Arial" w:hAnsi="Arial" w:cs="Arial"/>
+                <w:sz w:val="16"/>
+                <w:szCs w:val="16"/>
+                <w:lang w:val="en-US"/>
+              </w:rPr>
+              <w:t>kpp</w:t>
+            </w:r>
+            <w:r>
+              <w:rPr>
+                <w:rFonts w:ascii="Arial" w:hAnsi="Arial" w:cs="Arial"/>
+                <w:sz w:val="16"/>
+                <w:szCs w:val="16"/>
+              </w:rPr>
+              <w:t xml:space="preserve"> %}</w:t>
+            </w:r>
+            <w:r>
+              <w:rPr>
+                <w:rFonts w:ascii="Arial" w:hAnsi="Arial" w:cs="Arial"/>
+                <w:sz w:val="16"/>
+                <w:szCs w:val="16"/>
+              </w:rPr>
+              <w:t>КПП</w:t>
+            </w:r>
+            <w:r>
+              <w:rPr>
+                <w:rFonts w:ascii="Arial" w:hAnsi="Arial" w:cs="Arial"/>
+                <w:sz w:val="16"/>
+                <w:szCs w:val="16"/>
+              </w:rPr>
+              <w:t xml:space="preserve"> {{ </w:t>
+            </w:r>
+            <w:r>
+              <w:rPr>
+                <w:rFonts w:ascii="Arial" w:hAnsi="Arial" w:cs="Arial"/>
+                <w:sz w:val="16"/>
+                <w:szCs w:val="16"/>
+                <w:lang w:val="en-US"/>
+              </w:rPr>
+              <w:t>client</w:t>
+            </w:r>
+            <w:r>
+              <w:rPr>
+                <w:rFonts w:ascii="Arial" w:hAnsi="Arial" w:cs="Arial"/>
+                <w:sz w:val="16"/>
+                <w:szCs w:val="16"/>
+              </w:rPr>
+              <w:t>.</w:t>
+            </w:r>
+            <w:r>
+              <w:rPr>
+                <w:rFonts w:ascii="Arial" w:hAnsi="Arial" w:cs="Arial"/>
+                <w:sz w:val="16"/>
+                <w:szCs w:val="16"/>
+                <w:lang w:val="en-US"/>
+              </w:rPr>
+              <w:t>kpp</w:t>
+            </w:r>
+            <w:r>
+              <w:rPr>
+                <w:rFonts w:ascii="Arial" w:hAnsi="Arial" w:cs="Arial"/>
+                <w:sz w:val="16"/>
+                <w:szCs w:val="16"/>
+              </w:rPr>
+              <w:t xml:space="preserve"> }}{% </w:t>
+            </w:r>
+            <w:r>
+              <w:rPr>
+                <w:rFonts w:ascii="Arial" w:hAnsi="Arial" w:cs="Arial"/>
+                <w:sz w:val="16"/>
+                <w:szCs w:val="16"/>
+                <w:lang w:val="en-US"/>
+              </w:rPr>
+              <w:t>endif</w:t>
+            </w:r>
+            <w:r>
+              <w:rPr>
+                <w:rFonts w:ascii="Arial" w:hAnsi="Arial" w:cs="Arial"/>
+                <w:sz w:val="16"/>
+                <w:szCs w:val="16"/>
+              </w:rPr>
+              <w:t xml:space="preserve"> %}</w:t>
+            </w:r>
+          </w:p>
+          <w:p>
+            <w:pPr>
+              <w:rPr>
+                <w:rFonts w:ascii="Arial" w:hAnsi="Arial" w:cs="Arial"/>
+                <w:sz w:val="16"/>
+                <w:szCs w:val="16"/>
+              </w:rPr>
+            </w:pPr>
+            <w:r>
+              <w:rPr>
+                <w:rFonts w:ascii="Arial" w:hAnsi="Arial" w:cs="Arial"/>
+                <w:sz w:val="16"/>
+                <w:szCs w:val="16"/>
+              </w:rPr>
+              <w:t>ОГРН</w:t>
+            </w:r>
+            <w:r>
+              <w:rPr>
+                <w:rFonts w:ascii="Arial" w:hAnsi="Arial" w:cs="Arial"/>
+                <w:sz w:val="16"/>
+                <w:szCs w:val="16"/>
               </w:rPr>
               <w:t xml:space="preserve"> </w:t>
             </w:r>
@@ -2430,17 +2659,137 @@
                 <w:rFonts w:ascii="Arial" w:hAnsi="Arial" w:cs="Arial"/>
                 <w:sz w:val="16"/>
                 <w:szCs w:val="16"/>
-                <w:lang w:val="en-US"/>
-              </w:rPr>
-              <w:t>{% if client.kpp %}</w:t>
-            </w:r>
-            <w:r>
-              <w:rPr>
-                <w:rFonts w:ascii="Arial" w:hAnsi="Arial" w:cs="Arial"/>
-                <w:sz w:val="16"/>
-                <w:szCs w:val="16"/>
-              </w:rPr>
-              <w:t>КПП</w:t>
+              </w:rPr>
+              <w:t xml:space="preserve">{{ </w:t>
+            </w:r>
+            <w:r>
+              <w:rPr>
+                <w:rFonts w:ascii="Arial" w:hAnsi="Arial" w:cs="Arial"/>
+                <w:sz w:val="16"/>
+                <w:szCs w:val="16"/>
+                <w:lang w:val="en-US"/>
+              </w:rPr>
+              <w:t>client</w:t>
+            </w:r>
+            <w:r>
+              <w:rPr>
+                <w:rFonts w:ascii="Arial" w:hAnsi="Arial" w:cs="Arial"/>
+                <w:sz w:val="16"/>
+                <w:szCs w:val="16"/>
+              </w:rPr>
+              <w:t>.</w:t>
+            </w:r>
+            <w:r>
+              <w:rPr>
+                <w:rFonts w:ascii="Arial" w:hAnsi="Arial" w:cs="Arial"/>
+                <w:sz w:val="16"/>
+                <w:szCs w:val="16"/>
+                <w:lang w:val="en-US"/>
+              </w:rPr>
+              <w:t>ogrn</w:t>
+            </w:r>
+            <w:r>
+              <w:rPr>
+                <w:rFonts w:ascii="Arial" w:hAnsi="Arial" w:cs="Arial"/>
+                <w:sz w:val="16"/>
+                <w:szCs w:val="16"/>
+              </w:rPr>
+              <w:t xml:space="preserve"> }}</w:t>
+            </w:r>
+          </w:p>
+          <w:p>
+            <w:pPr>
+              <w:rPr>
+                <w:rFonts w:ascii="Arial" w:hAnsi="Arial" w:cs="Arial"/>
+                <w:sz w:val="16"/>
+                <w:szCs w:val="16"/>
+              </w:rPr>
+            </w:pPr>
+            <w:r>
+              <w:rPr>
+                <w:rFonts w:ascii="Arial" w:hAnsi="Arial" w:cs="Arial"/>
+                <w:sz w:val="16"/>
+                <w:szCs w:val="16"/>
+              </w:rPr>
+              <w:t>А</w:t>
+            </w:r>
+            <w:r>
+              <w:rPr>
+                <w:rFonts w:ascii="Arial" w:hAnsi="Arial" w:cs="Arial"/>
+                <w:sz w:val="16"/>
+                <w:szCs w:val="16"/>
+              </w:rPr>
+              <w:t xml:space="preserve">дрес: </w:t>
+            </w:r>
+            <w:r>
+              <w:rPr>
+                <w:rFonts w:ascii="Arial" w:hAnsi="Arial" w:cs="Arial"/>
+                <w:sz w:val="16"/>
+                <w:szCs w:val="16"/>
+              </w:rPr>
+              <w:t xml:space="preserve">{{ </w:t>
+            </w:r>
+            <w:r>
+              <w:rPr>
+                <w:rFonts w:ascii="Arial" w:hAnsi="Arial" w:cs="Arial"/>
+                <w:sz w:val="16"/>
+                <w:szCs w:val="16"/>
+                <w:lang w:val="en-US"/>
+              </w:rPr>
+              <w:t>client</w:t>
+            </w:r>
+            <w:r>
+              <w:rPr>
+                <w:rFonts w:ascii="Arial" w:hAnsi="Arial" w:cs="Arial"/>
+                <w:sz w:val="16"/>
+                <w:szCs w:val="16"/>
+              </w:rPr>
+              <w:t>.</w:t>
+            </w:r>
+            <w:r>
+              <w:rPr>
+                <w:rFonts w:ascii="Arial" w:hAnsi="Arial" w:cs="Arial"/>
+                <w:sz w:val="16"/>
+                <w:szCs w:val="16"/>
+                <w:lang w:val="en-US"/>
+              </w:rPr>
+              <w:t>address</w:t>
+            </w:r>
+            <w:r>
+              <w:rPr>
+                <w:rFonts w:ascii="Arial" w:hAnsi="Arial" w:cs="Arial"/>
+                <w:sz w:val="16"/>
+                <w:szCs w:val="16"/>
+              </w:rPr>
+              <w:t xml:space="preserve"> }}</w:t>
+            </w:r>
+          </w:p>
+          <w:p>
+            <w:pPr>
+              <w:rPr>
+                <w:rFonts w:ascii="Arial" w:hAnsi="Arial" w:cs="Arial"/>
+                <w:sz w:val="16"/>
+                <w:szCs w:val="16"/>
+                <w:lang w:val="en-US"/>
+              </w:rPr>
+            </w:pPr>
+            <w:r>
+              <w:rPr>
+                <w:rFonts w:ascii="Arial" w:hAnsi="Arial" w:cs="Arial"/>
+                <w:sz w:val="16"/>
+                <w:szCs w:val="16"/>
+                <w:lang w:val="en-US"/>
+              </w:rPr>
+              <w:t xml:space="preserve">{% </w:t>
+            </w:r>
+            <w:r>
+              <w:rPr>
+                <w:rFonts w:ascii="Arial" w:hAnsi="Arial" w:cs="Arial"/>
+                <w:sz w:val="16"/>
+                <w:szCs w:val="16"/>
+                <w:lang w:val="en-US"/>
+              </w:rPr>
+              <w:t>if</w:t>
             </w:r>
             <w:r>
               <w:rPr>
@@ -2458,48 +2807,6 @@
                 <w:szCs w:val="16"/>
                 <w:lang w:val="en-US"/>
               </w:rPr>
-              <w:t>{{ client.kpp }}{% endif %}</w:t>
-            </w:r>
-          </w:p>
-          <w:p>
-            <w:pPr>
-              <w:rPr>
-                <w:rFonts w:ascii="Arial" w:hAnsi="Arial" w:cs="Arial"/>
-                <w:sz w:val="16"/>
-                <w:szCs w:val="16"/>
-              </w:rPr>
-            </w:pPr>
-            <w:r>
-              <w:rPr>
-                <w:rFonts w:ascii="Arial" w:hAnsi="Arial" w:cs="Arial"/>
-                <w:sz w:val="16"/>
-                <w:szCs w:val="16"/>
-              </w:rPr>
-              <w:t>ОГРН</w:t>
-            </w:r>
-            <w:r>
-              <w:rPr>
-                <w:rFonts w:ascii="Arial" w:hAnsi="Arial" w:cs="Arial"/>
-                <w:sz w:val="16"/>
-                <w:szCs w:val="16"/>
-              </w:rPr>
-              <w:t xml:space="preserve"> </w:t>
-            </w:r>
-            <w:r>
-              <w:rPr>
-                <w:rFonts w:ascii="Arial" w:hAnsi="Arial" w:cs="Arial"/>
-                <w:sz w:val="16"/>
-                <w:szCs w:val="16"/>
-              </w:rPr>
-              <w:t xml:space="preserve">{{ </w:t>
-            </w:r>
-            <w:r>
-              <w:rPr>
-                <w:rFonts w:ascii="Arial" w:hAnsi="Arial" w:cs="Arial"/>
-                <w:sz w:val="16"/>
-                <w:szCs w:val="16"/>
-                <w:lang w:val="en-US"/>
-              </w:rPr>
               <w:t>client</w:t>
             </w:r>
             <w:r>
@@ -2507,6 +2814,7 @@
                 <w:rFonts w:ascii="Arial" w:hAnsi="Arial" w:cs="Arial"/>
                 <w:sz w:val="16"/>
                 <w:szCs w:val="16"/>
+                <w:lang w:val="en-US"/>
               </w:rPr>
               <w:t>.</w:t>
             </w:r>
@@ -2517,145 +2825,6 @@
                 <w:szCs w:val="16"/>
                 <w:lang w:val="en-US"/>
               </w:rPr>
-              <w:t>ogrn</w:t>
-            </w:r>
-            <w:r>
-              <w:rPr>
-                <w:rFonts w:ascii="Arial" w:hAnsi="Arial" w:cs="Arial"/>
-                <w:sz w:val="16"/>
-                <w:szCs w:val="16"/>
-              </w:rPr>
-              <w:t xml:space="preserve"> }}</w:t>
-            </w:r>
-          </w:p>
-          <w:p>
-            <w:pPr>
-              <w:rPr>
-                <w:rFonts w:ascii="Arial" w:hAnsi="Arial" w:cs="Arial"/>
-                <w:sz w:val="16"/>
-                <w:szCs w:val="16"/>
-              </w:rPr>
-            </w:pPr>
-            <w:r>
-              <w:rPr>
-                <w:rFonts w:ascii="Arial" w:hAnsi="Arial" w:cs="Arial"/>
-                <w:sz w:val="16"/>
-                <w:szCs w:val="16"/>
-              </w:rPr>
-              <w:t>А</w:t>
-            </w:r>
-            <w:r>
-              <w:rPr>
-                <w:rFonts w:ascii="Arial" w:hAnsi="Arial" w:cs="Arial"/>
-                <w:sz w:val="16"/>
-                <w:szCs w:val="16"/>
-              </w:rPr>
-              <w:t xml:space="preserve">дрес: </w:t>
-            </w:r>
-            <w:r>
-              <w:rPr>
-                <w:rFonts w:ascii="Arial" w:hAnsi="Arial" w:cs="Arial"/>
-                <w:sz w:val="16"/>
-                <w:szCs w:val="16"/>
-              </w:rPr>
-              <w:t xml:space="preserve">{{ </w:t>
-            </w:r>
-            <w:r>
-              <w:rPr>
-                <w:rFonts w:ascii="Arial" w:hAnsi="Arial" w:cs="Arial"/>
-                <w:sz w:val="16"/>
-                <w:szCs w:val="16"/>
-                <w:lang w:val="en-US"/>
-              </w:rPr>
-              <w:t>client</w:t>
-            </w:r>
-            <w:r>
-              <w:rPr>
-                <w:rFonts w:ascii="Arial" w:hAnsi="Arial" w:cs="Arial"/>
-                <w:sz w:val="16"/>
-                <w:szCs w:val="16"/>
-              </w:rPr>
-              <w:t>.</w:t>
-            </w:r>
-            <w:r>
-              <w:rPr>
-                <w:rFonts w:ascii="Arial" w:hAnsi="Arial" w:cs="Arial"/>
-                <w:sz w:val="16"/>
-                <w:szCs w:val="16"/>
-                <w:lang w:val="en-US"/>
-              </w:rPr>
-              <w:t>address</w:t>
-            </w:r>
-            <w:r>
-              <w:rPr>
-                <w:rFonts w:ascii="Arial" w:hAnsi="Arial" w:cs="Arial"/>
-                <w:sz w:val="16"/>
-                <w:szCs w:val="16"/>
-              </w:rPr>
-              <w:t xml:space="preserve"> }}</w:t>
-            </w:r>
-          </w:p>
-          <w:p>
-            <w:pPr>
-              <w:rPr>
-                <w:rFonts w:ascii="Arial" w:hAnsi="Arial" w:cs="Arial"/>
-                <w:sz w:val="16"/>
-                <w:szCs w:val="16"/>
-                <w:lang w:val="en-US"/>
-              </w:rPr>
-            </w:pPr>
-            <w:r>
-              <w:rPr>
-                <w:rFonts w:ascii="Arial" w:hAnsi="Arial" w:cs="Arial"/>
-                <w:sz w:val="16"/>
-                <w:szCs w:val="16"/>
-                <w:lang w:val="en-US"/>
-              </w:rPr>
-              <w:t xml:space="preserve">{% </w:t>
-            </w:r>
-            <w:r>
-              <w:rPr>
-                <w:rFonts w:ascii="Arial" w:hAnsi="Arial" w:cs="Arial"/>
-                <w:sz w:val="16"/>
-                <w:szCs w:val="16"/>
-                <w:lang w:val="en-US"/>
-              </w:rPr>
-              <w:t>if</w:t>
-            </w:r>
-            <w:r>
-              <w:rPr>
-                <w:rFonts w:ascii="Arial" w:hAnsi="Arial" w:cs="Arial"/>
-                <w:sz w:val="16"/>
-                <w:szCs w:val="16"/>
-                <w:lang w:val="en-US"/>
-              </w:rPr>
-              <w:t xml:space="preserve"> </w:t>
-            </w:r>
-            <w:r>
-              <w:rPr>
-                <w:rFonts w:ascii="Arial" w:hAnsi="Arial" w:cs="Arial"/>
-                <w:sz w:val="16"/>
-                <w:szCs w:val="16"/>
-                <w:lang w:val="en-US"/>
-              </w:rPr>
-              <w:t>client</w:t>
-            </w:r>
-            <w:r>
-              <w:rPr>
-                <w:rFonts w:ascii="Arial" w:hAnsi="Arial" w:cs="Arial"/>
-                <w:sz w:val="16"/>
-                <w:szCs w:val="16"/>
-                <w:lang w:val="en-US"/>
-              </w:rPr>
-              <w:t>.</w:t>
-            </w:r>
-            <w:r>
-              <w:rPr>
-                <w:rFonts w:ascii="Arial" w:hAnsi="Arial" w:cs="Arial"/>
-                <w:sz w:val="16"/>
-                <w:szCs w:val="16"/>
-                <w:lang w:val="en-US"/>
-              </w:rPr>
               <w:t>phone</w:t>
             </w:r>
             <w:r>
@@ -2665,16 +2834,7 @@
                 <w:szCs w:val="16"/>
                 <w:lang w:val="en-US"/>
               </w:rPr>
-              <w:t xml:space="preserve"> %}</w:t>
-            </w:r>
-            <w:r>
-              <w:rPr>
-                <w:rFonts w:ascii="Arial" w:hAnsi="Arial" w:cs="Arial"/>
-                <w:sz w:val="16"/>
-                <w:szCs w:val="16"/>
-                <w:lang w:val="en-US"/>
-              </w:rPr>
-              <w:t xml:space="preserve"> </w:t>
+              <w:t xml:space="preserve"> %} </w:t>
             </w:r>
             <w:r>
               <w:rPr>
@@ -3380,25 +3540,7 @@
                 <w:szCs w:val="20"/>
                 <w:lang w:val="en-US"/>
               </w:rPr>
-              <w:t xml:space="preserve">{% if client.director %}{{ </w:t>
-            </w:r>
-            <w:r>
-              <w:rPr>
-                <w:rFonts w:ascii="Arial" w:hAnsi="Arial" w:cs="Arial"/>
-                <w:sz w:val="20"/>
-                <w:szCs w:val="20"/>
-                <w:lang w:val="en-US"/>
-              </w:rPr>
-              <w:t>client.director</w:t>
-            </w:r>
-            <w:r>
-              <w:rPr>
-                <w:rFonts w:ascii="Arial" w:hAnsi="Arial" w:cs="Arial"/>
-                <w:sz w:val="20"/>
-                <w:szCs w:val="20"/>
-                <w:lang w:val="en-US"/>
-              </w:rPr>
-              <w:t xml:space="preserve"> }}</w:t>
+              <w:t>{% if client.director %}{{ client.director }}</w:t>
             </w:r>
             <w:r>
               <w:rPr>

</xml_diff>